<commit_message>
Update developer name in legal documents
</commit_message>
<xml_diff>
--- a/lagal docs/new docs/myauto_terms_of_use_en_firebase_updated.docx
+++ b/lagal docs/new docs/myauto_terms_of_use_en_firebase_updated.docx
@@ -27,7 +27,7 @@
     </w:p>
     <w:p>
       <w:r>
-        <w:t>These Terms of Use (“Terms”) govern your use of the “My Auto” mobile application (“App”), developed by Igor Zotov (“Developer”, “we”, “us”).</w:t>
+        <w:t>These Terms of Use (“Terms”) govern your use of the “My Auto” mobile application (“App”), developed by Ravil Novruzov (“Developer”, “we”, “us”).</w:t>
       </w:r>
     </w:p>
     <w:p>
@@ -407,7 +407,7 @@
     </w:p>
     <w:p>
       <w:r>
-        <w:t>Developer: Igor Zotov.</w:t>
+        <w:t>Developer: Ravil Novruzov.</w:t>
       </w:r>
     </w:p>
     <w:sectPr>

</xml_diff>